<commit_message>
Final application with ai integration
</commit_message>
<xml_diff>
--- a/Za front end nase aplikacije korisiti se angular dok se za bekend koristi.docx
+++ b/Za front end nase aplikacije korisiti se angular dok se za bekend koristi.docx
@@ -1,6 +1,6 @@
 
 <file path=word/document.xml><?xml version="1.0" encoding="utf-8"?>
-<w:document xmlns:wpc="http://schemas.microsoft.com/office/word/2010/wordprocessingCanvas" xmlns:cx="http://schemas.microsoft.com/office/drawing/2014/chartex" xmlns:cx1="http://schemas.microsoft.com/office/drawing/2015/9/8/chartex" xmlns:cx2="http://schemas.microsoft.com/office/drawing/2015/10/21/chartex" xmlns:cx3="http://schemas.microsoft.com/office/drawing/2016/5/9/chartex" xmlns:cx4="http://schemas.microsoft.com/office/drawing/2016/5/10/chartex" xmlns:cx5="http://schemas.microsoft.com/office/drawing/2016/5/11/chartex" xmlns:cx6="http://schemas.microsoft.com/office/drawing/2016/5/12/chartex" xmlns:cx7="http://schemas.microsoft.com/office/drawing/2016/5/13/chartex" xmlns:cx8="http://schemas.microsoft.com/office/drawing/2016/5/14/chartex" xmlns:mc="http://schemas.openxmlformats.org/markup-compatibility/2006" xmlns:aink="http://schemas.microsoft.com/office/drawing/2016/ink" xmlns:am3d="http://schemas.microsoft.com/office/drawing/2017/model3d" xmlns:o="urn:schemas-microsoft-com:office:office" xmlns:oel="http://schemas.microsoft.com/office/2019/extlst" xmlns:r="http://schemas.openxmlformats.org/officeDocument/2006/relationships" xmlns:m="http://schemas.openxmlformats.org/officeDocument/2006/math" xmlns:v="urn:schemas-microsoft-com:vml" xmlns:wp14="http://schemas.microsoft.com/office/word/2010/wordprocessingDrawing" xmlns:wp="http://schemas.openxmlformats.org/drawingml/2006/wordprocessingDrawing" xmlns:w10="urn:schemas-microsoft-com:office:word" xmlns:w="http://schemas.openxmlformats.org/wordprocessingml/2006/main" xmlns:w14="http://schemas.microsoft.com/office/word/2010/wordml" xmlns:w15="http://schemas.microsoft.com/office/word/2012/wordml" xmlns:w16cex="http://schemas.microsoft.com/office/word/2018/wordml/cex" xmlns:w16cid="http://schemas.microsoft.com/office/word/2016/wordml/cid" xmlns:w16="http://schemas.microsoft.com/office/word/2018/wordml" xmlns:w16du="http://schemas.microsoft.com/office/word/2023/wordml/word16du" xmlns:w16sdtdh="http://schemas.microsoft.com/office/word/2020/wordml/sdtdatahash" xmlns:w16se="http://schemas.microsoft.com/office/word/2015/wordml/symex" xmlns:wpg="http://schemas.microsoft.com/office/word/2010/wordprocessingGroup" xmlns:wpi="http://schemas.microsoft.com/office/word/2010/wordprocessingInk" xmlns:wne="http://schemas.microsoft.com/office/word/2006/wordml" xmlns:wps="http://schemas.microsoft.com/office/word/2010/wordprocessingShape" mc:Ignorable="w14 w15 w16se w16cid w16 w16cex w16sdtdh w16du wp14">
+<w:document xmlns:wpc="http://schemas.microsoft.com/office/word/2010/wordprocessingCanvas" xmlns:cx="http://schemas.microsoft.com/office/drawing/2014/chartex" xmlns:cx1="http://schemas.microsoft.com/office/drawing/2015/9/8/chartex" xmlns:cx2="http://schemas.microsoft.com/office/drawing/2015/10/21/chartex" xmlns:cx3="http://schemas.microsoft.com/office/drawing/2016/5/9/chartex" xmlns:cx4="http://schemas.microsoft.com/office/drawing/2016/5/10/chartex" xmlns:cx5="http://schemas.microsoft.com/office/drawing/2016/5/11/chartex" xmlns:cx6="http://schemas.microsoft.com/office/drawing/2016/5/12/chartex" xmlns:cx7="http://schemas.microsoft.com/office/drawing/2016/5/13/chartex" xmlns:cx8="http://schemas.microsoft.com/office/drawing/2016/5/14/chartex" xmlns:mc="http://schemas.openxmlformats.org/markup-compatibility/2006" xmlns:aink="http://schemas.microsoft.com/office/drawing/2016/ink" xmlns:am3d="http://schemas.microsoft.com/office/drawing/2017/model3d" xmlns:o="urn:schemas-microsoft-com:office:office" xmlns:oel="http://schemas.microsoft.com/office/2019/extlst" xmlns:r="http://schemas.openxmlformats.org/officeDocument/2006/relationships" xmlns:m="http://schemas.openxmlformats.org/officeDocument/2006/math" xmlns:v="urn:schemas-microsoft-com:vml" xmlns:wp14="http://schemas.microsoft.com/office/word/2010/wordprocessingDrawing" xmlns:wp="http://schemas.openxmlformats.org/drawingml/2006/wordprocessingDrawing" xmlns:w10="urn:schemas-microsoft-com:office:word" xmlns:w="http://schemas.openxmlformats.org/wordprocessingml/2006/main" xmlns:w14="http://schemas.microsoft.com/office/word/2010/wordml" xmlns:w15="http://schemas.microsoft.com/office/word/2012/wordml" xmlns:w16cex="http://schemas.microsoft.com/office/word/2018/wordml/cex" xmlns:w16cid="http://schemas.microsoft.com/office/word/2016/wordml/cid" xmlns:w16="http://schemas.microsoft.com/office/word/2018/wordml" xmlns:w16du="http://schemas.microsoft.com/office/word/2023/wordml/word16du" xmlns:w16sdtdh="http://schemas.microsoft.com/office/word/2020/wordml/sdtdatahash" xmlns:w16sdtfl="http://schemas.microsoft.com/office/word/2024/wordml/sdtformatlock" xmlns:w16se="http://schemas.microsoft.com/office/word/2015/wordml/symex" xmlns:wpg="http://schemas.microsoft.com/office/word/2010/wordprocessingGroup" xmlns:wpi="http://schemas.microsoft.com/office/word/2010/wordprocessingInk" xmlns:wne="http://schemas.microsoft.com/office/word/2006/wordml" xmlns:wps="http://schemas.microsoft.com/office/word/2010/wordprocessingShape" mc:Ignorable="w14 w15 w16se w16cid w16 w16cex w16sdtdh w16sdtfl w16du wp14">
   <w:body>
     <w:p>
       <w:r>
@@ -61,6 +61,7 @@
                                 </w14:textOutline>
                               </w:rPr>
                             </w:pPr>
+                            <w:proofErr w:type="spellStart"/>
                             <w:r>
                               <w:rPr>
                                 <w:color w:val="000000" w:themeColor="text1"/>
@@ -77,7 +78,26 @@
                                   <w14:round/>
                                 </w14:textOutline>
                               </w:rPr>
-                              <w:t>Projekat KupiAuto</w:t>
+                              <w:t>Projekat</w:t>
+                            </w:r>
+                            <w:proofErr w:type="spellEnd"/>
+                            <w:r>
+                              <w:rPr>
+                                <w:color w:val="000000" w:themeColor="text1"/>
+                                <w:sz w:val="72"/>
+                                <w:szCs w:val="72"/>
+                                <w14:shadow w14:blurRad="38100" w14:dist="19050" w14:dir="2700000" w14:sx="100000" w14:sy="100000" w14:kx="0" w14:ky="0" w14:algn="tl">
+                                  <w14:schemeClr w14:val="dk1">
+                                    <w14:alpha w14:val="60000"/>
+                                  </w14:schemeClr>
+                                </w14:shadow>
+                                <w14:textOutline w14:w="0" w14:cap="flat" w14:cmpd="sng" w14:algn="ctr">
+                                  <w14:noFill/>
+                                  <w14:prstDash w14:val="solid"/>
+                                  <w14:round/>
+                                </w14:textOutline>
+                              </w:rPr>
+                              <w:t xml:space="preserve"> KupiAuto</w:t>
                             </w:r>
                           </w:p>
                         </w:txbxContent>
@@ -122,6 +142,7 @@
                           </w14:textOutline>
                         </w:rPr>
                       </w:pPr>
+                      <w:proofErr w:type="spellStart"/>
                       <w:r>
                         <w:rPr>
                           <w:color w:val="000000" w:themeColor="text1"/>
@@ -138,7 +159,26 @@
                             <w14:round/>
                           </w14:textOutline>
                         </w:rPr>
-                        <w:t>Projekat KupiAuto</w:t>
+                        <w:t>Projekat</w:t>
+                      </w:r>
+                      <w:proofErr w:type="spellEnd"/>
+                      <w:r>
+                        <w:rPr>
+                          <w:color w:val="000000" w:themeColor="text1"/>
+                          <w:sz w:val="72"/>
+                          <w:szCs w:val="72"/>
+                          <w14:shadow w14:blurRad="38100" w14:dist="19050" w14:dir="2700000" w14:sx="100000" w14:sy="100000" w14:kx="0" w14:ky="0" w14:algn="tl">
+                            <w14:schemeClr w14:val="dk1">
+                              <w14:alpha w14:val="60000"/>
+                            </w14:schemeClr>
+                          </w14:shadow>
+                          <w14:textOutline w14:w="0" w14:cap="flat" w14:cmpd="sng" w14:algn="ctr">
+                            <w14:noFill/>
+                            <w14:prstDash w14:val="solid"/>
+                            <w14:round/>
+                          </w14:textOutline>
+                        </w:rPr>
+                        <w:t xml:space="preserve"> KupiAuto</w:t>
                       </w:r>
                     </w:p>
                   </w:txbxContent>
@@ -164,7 +204,79 @@
         </w:tabs>
       </w:pPr>
       <w:r>
-        <w:t>Za front end nase aplikacije korisiti se angular dok se za bekend koristi .net. Bekend se pise na C# jeziku.</w:t>
+        <w:t xml:space="preserve">Za front end nase </w:t>
+      </w:r>
+      <w:proofErr w:type="spellStart"/>
+      <w:r>
+        <w:t>aplikacije</w:t>
+      </w:r>
+      <w:proofErr w:type="spellEnd"/>
+      <w:r>
+        <w:t xml:space="preserve"> </w:t>
+      </w:r>
+      <w:proofErr w:type="spellStart"/>
+      <w:r>
+        <w:t>korisiti</w:t>
+      </w:r>
+      <w:proofErr w:type="spellEnd"/>
+      <w:r>
+        <w:t xml:space="preserve"> se angular </w:t>
+      </w:r>
+      <w:proofErr w:type="spellStart"/>
+      <w:r>
+        <w:t>dok</w:t>
+      </w:r>
+      <w:proofErr w:type="spellEnd"/>
+      <w:r>
+        <w:t xml:space="preserve"> se za </w:t>
+      </w:r>
+      <w:proofErr w:type="spellStart"/>
+      <w:r>
+        <w:t>bekend</w:t>
+      </w:r>
+      <w:proofErr w:type="spellEnd"/>
+      <w:r>
+        <w:t xml:space="preserve"> </w:t>
+      </w:r>
+      <w:proofErr w:type="spellStart"/>
+      <w:r>
+        <w:t>koristi</w:t>
+      </w:r>
+      <w:proofErr w:type="spellEnd"/>
+      <w:r>
+        <w:t xml:space="preserve"> .net. </w:t>
+      </w:r>
+      <w:proofErr w:type="spellStart"/>
+      <w:r>
+        <w:t>Bekend</w:t>
+      </w:r>
+      <w:proofErr w:type="spellEnd"/>
+      <w:r>
+        <w:t xml:space="preserve"> se </w:t>
+      </w:r>
+      <w:proofErr w:type="spellStart"/>
+      <w:r>
+        <w:t>pise</w:t>
+      </w:r>
+      <w:proofErr w:type="spellEnd"/>
+      <w:r>
+        <w:t xml:space="preserve"> </w:t>
+      </w:r>
+      <w:proofErr w:type="spellStart"/>
+      <w:r>
+        <w:t>na</w:t>
+      </w:r>
+      <w:proofErr w:type="spellEnd"/>
+      <w:r>
+        <w:t xml:space="preserve"> C# </w:t>
+      </w:r>
+      <w:proofErr w:type="spellStart"/>
+      <w:r>
+        <w:t>jeziku</w:t>
+      </w:r>
+      <w:proofErr w:type="spellEnd"/>
+      <w:r>
+        <w:t>.</w:t>
       </w:r>
     </w:p>
     <w:p>
@@ -180,8 +292,178 @@
           <w:tab w:val="left" w:pos="8040"/>
         </w:tabs>
       </w:pPr>
-      <w:r>
-        <w:t xml:space="preserve">Entiti  framework se koristi kako bi se upravljalo podacima u bazi podataka, koristimo ef migrations kako bi napravili “migracije” one ce praviti tabele pomocu entitea koje smo mi napravili. </w:t>
+      <w:proofErr w:type="spellStart"/>
+      <w:proofErr w:type="gramStart"/>
+      <w:r>
+        <w:t>Entiti</w:t>
+      </w:r>
+      <w:proofErr w:type="spellEnd"/>
+      <w:r>
+        <w:t xml:space="preserve">  framework</w:t>
+      </w:r>
+      <w:proofErr w:type="gramEnd"/>
+      <w:r>
+        <w:t xml:space="preserve"> se </w:t>
+      </w:r>
+      <w:proofErr w:type="spellStart"/>
+      <w:r>
+        <w:t>koristi</w:t>
+      </w:r>
+      <w:proofErr w:type="spellEnd"/>
+      <w:r>
+        <w:t xml:space="preserve"> </w:t>
+      </w:r>
+      <w:proofErr w:type="spellStart"/>
+      <w:r>
+        <w:t>kako</w:t>
+      </w:r>
+      <w:proofErr w:type="spellEnd"/>
+      <w:r>
+        <w:t xml:space="preserve"> bi se </w:t>
+      </w:r>
+      <w:proofErr w:type="spellStart"/>
+      <w:r>
+        <w:t>upravljalo</w:t>
+      </w:r>
+      <w:proofErr w:type="spellEnd"/>
+      <w:r>
+        <w:t xml:space="preserve"> </w:t>
+      </w:r>
+      <w:proofErr w:type="spellStart"/>
+      <w:r>
+        <w:t>podacima</w:t>
+      </w:r>
+      <w:proofErr w:type="spellEnd"/>
+      <w:r>
+        <w:t xml:space="preserve"> u </w:t>
+      </w:r>
+      <w:proofErr w:type="spellStart"/>
+      <w:r>
+        <w:t>bazi</w:t>
+      </w:r>
+      <w:proofErr w:type="spellEnd"/>
+      <w:r>
+        <w:t xml:space="preserve"> </w:t>
+      </w:r>
+      <w:proofErr w:type="spellStart"/>
+      <w:r>
+        <w:t>podataka</w:t>
+      </w:r>
+      <w:proofErr w:type="spellEnd"/>
+      <w:r>
+        <w:t xml:space="preserve">, </w:t>
+      </w:r>
+      <w:proofErr w:type="spellStart"/>
+      <w:r>
+        <w:t>koristimo</w:t>
+      </w:r>
+      <w:proofErr w:type="spellEnd"/>
+      <w:r>
+        <w:t xml:space="preserve"> </w:t>
+      </w:r>
+      <w:proofErr w:type="spellStart"/>
+      <w:r>
+        <w:t>ef</w:t>
+      </w:r>
+      <w:proofErr w:type="spellEnd"/>
+      <w:r>
+        <w:t xml:space="preserve"> migrations </w:t>
+      </w:r>
+      <w:proofErr w:type="spellStart"/>
+      <w:r>
+        <w:t>kako</w:t>
+      </w:r>
+      <w:proofErr w:type="spellEnd"/>
+      <w:r>
+        <w:t xml:space="preserve"> </w:t>
+      </w:r>
+      <w:proofErr w:type="spellStart"/>
+      <w:r>
+        <w:t>bi</w:t>
+      </w:r>
+      <w:proofErr w:type="spellEnd"/>
+      <w:r>
+        <w:t xml:space="preserve"> </w:t>
+      </w:r>
+      <w:proofErr w:type="spellStart"/>
+      <w:r>
+        <w:t>napravili</w:t>
+      </w:r>
+      <w:proofErr w:type="spellEnd"/>
+      <w:r>
+        <w:t xml:space="preserve"> “</w:t>
+      </w:r>
+      <w:proofErr w:type="spellStart"/>
+      <w:r>
+        <w:t>migracije</w:t>
+      </w:r>
+      <w:proofErr w:type="spellEnd"/>
+      <w:r>
+        <w:t xml:space="preserve">” one </w:t>
+      </w:r>
+      <w:proofErr w:type="spellStart"/>
+      <w:r>
+        <w:t>ce</w:t>
+      </w:r>
+      <w:proofErr w:type="spellEnd"/>
+      <w:r>
+        <w:t xml:space="preserve"> </w:t>
+      </w:r>
+      <w:proofErr w:type="spellStart"/>
+      <w:r>
+        <w:t>praviti</w:t>
+      </w:r>
+      <w:proofErr w:type="spellEnd"/>
+      <w:r>
+        <w:t xml:space="preserve"> </w:t>
+      </w:r>
+      <w:proofErr w:type="spellStart"/>
+      <w:r>
+        <w:t>tabele</w:t>
+      </w:r>
+      <w:proofErr w:type="spellEnd"/>
+      <w:r>
+        <w:t xml:space="preserve"> </w:t>
+      </w:r>
+      <w:proofErr w:type="spellStart"/>
+      <w:r>
+        <w:t>pomocu</w:t>
+      </w:r>
+      <w:proofErr w:type="spellEnd"/>
+      <w:r>
+        <w:t xml:space="preserve"> </w:t>
+      </w:r>
+      <w:proofErr w:type="spellStart"/>
+      <w:r>
+        <w:t>entitea</w:t>
+      </w:r>
+      <w:proofErr w:type="spellEnd"/>
+      <w:r>
+        <w:t xml:space="preserve"> </w:t>
+      </w:r>
+      <w:proofErr w:type="spellStart"/>
+      <w:r>
+        <w:t>koje</w:t>
+      </w:r>
+      <w:proofErr w:type="spellEnd"/>
+      <w:r>
+        <w:t xml:space="preserve"> </w:t>
+      </w:r>
+      <w:proofErr w:type="spellStart"/>
+      <w:r>
+        <w:t>smo</w:t>
+      </w:r>
+      <w:proofErr w:type="spellEnd"/>
+      <w:r>
+        <w:t xml:space="preserve"> mi </w:t>
+      </w:r>
+      <w:proofErr w:type="spellStart"/>
+      <w:r>
+        <w:t>napravili</w:t>
+      </w:r>
+      <w:proofErr w:type="spellEnd"/>
+      <w:r>
+        <w:t xml:space="preserve">. </w:t>
       </w:r>
     </w:p>
     <w:p>
@@ -191,8 +473,21 @@
         </w:tabs>
       </w:pPr>
       <w:r>
-        <w:t>Komande koje koristimo</w:t>
-      </w:r>
+        <w:t xml:space="preserve">Komande </w:t>
+      </w:r>
+      <w:proofErr w:type="spellStart"/>
+      <w:r>
+        <w:t>koje</w:t>
+      </w:r>
+      <w:proofErr w:type="spellEnd"/>
+      <w:r>
+        <w:t xml:space="preserve"> </w:t>
+      </w:r>
+      <w:proofErr w:type="spellStart"/>
+      <w:r>
+        <w:t>koristimo</w:t>
+      </w:r>
+      <w:proofErr w:type="spellEnd"/>
     </w:p>
     <w:p>
       <w:pPr>
@@ -201,7 +496,15 @@
         </w:tabs>
       </w:pPr>
       <w:r>
-        <w:t>Dotnet ef database drop</w:t>
+        <w:t xml:space="preserve">Dotnet </w:t>
+      </w:r>
+      <w:proofErr w:type="spellStart"/>
+      <w:r>
+        <w:t>ef</w:t>
+      </w:r>
+      <w:proofErr w:type="spellEnd"/>
+      <w:r>
+        <w:t xml:space="preserve"> database drop</w:t>
       </w:r>
     </w:p>
     <w:p>
@@ -211,7 +514,15 @@
         </w:tabs>
       </w:pPr>
       <w:r>
-        <w:t>Dotnet ef database update</w:t>
+        <w:t xml:space="preserve">Dotnet </w:t>
+      </w:r>
+      <w:proofErr w:type="spellStart"/>
+      <w:r>
+        <w:t>ef</w:t>
+      </w:r>
+      <w:proofErr w:type="spellEnd"/>
+      <w:r>
+        <w:t xml:space="preserve"> database update</w:t>
       </w:r>
     </w:p>
     <w:p>
@@ -220,8 +531,157 @@
           <w:tab w:val="left" w:pos="8040"/>
         </w:tabs>
       </w:pPr>
-      <w:r>
-        <w:t xml:space="preserve">Klasa koju koristimno kako bi smo rekli koju klasu entiteta zelimo da imamo u bazi tj ubacimo u bazu. To je kao most izmedju api I baze  </w:t>
+      <w:proofErr w:type="spellStart"/>
+      <w:r>
+        <w:t>Klasa</w:t>
+      </w:r>
+      <w:proofErr w:type="spellEnd"/>
+      <w:r>
+        <w:t xml:space="preserve"> </w:t>
+      </w:r>
+      <w:proofErr w:type="spellStart"/>
+      <w:r>
+        <w:t>koju</w:t>
+      </w:r>
+      <w:proofErr w:type="spellEnd"/>
+      <w:r>
+        <w:t xml:space="preserve"> </w:t>
+      </w:r>
+      <w:proofErr w:type="spellStart"/>
+      <w:r>
+        <w:t>koristimno</w:t>
+      </w:r>
+      <w:proofErr w:type="spellEnd"/>
+      <w:r>
+        <w:t xml:space="preserve"> </w:t>
+      </w:r>
+      <w:proofErr w:type="spellStart"/>
+      <w:r>
+        <w:t>kako</w:t>
+      </w:r>
+      <w:proofErr w:type="spellEnd"/>
+      <w:r>
+        <w:t xml:space="preserve"> bi </w:t>
+      </w:r>
+      <w:proofErr w:type="spellStart"/>
+      <w:r>
+        <w:t>smo</w:t>
+      </w:r>
+      <w:proofErr w:type="spellEnd"/>
+      <w:r>
+        <w:t xml:space="preserve"> </w:t>
+      </w:r>
+      <w:proofErr w:type="spellStart"/>
+      <w:r>
+        <w:t>rekli</w:t>
+      </w:r>
+      <w:proofErr w:type="spellEnd"/>
+      <w:r>
+        <w:t xml:space="preserve"> </w:t>
+      </w:r>
+      <w:proofErr w:type="spellStart"/>
+      <w:r>
+        <w:t>koju</w:t>
+      </w:r>
+      <w:proofErr w:type="spellEnd"/>
+      <w:r>
+        <w:t xml:space="preserve"> </w:t>
+      </w:r>
+      <w:proofErr w:type="spellStart"/>
+      <w:r>
+        <w:t>klasu</w:t>
+      </w:r>
+      <w:proofErr w:type="spellEnd"/>
+      <w:r>
+        <w:t xml:space="preserve"> </w:t>
+      </w:r>
+      <w:proofErr w:type="spellStart"/>
+      <w:r>
+        <w:t>entiteta</w:t>
+      </w:r>
+      <w:proofErr w:type="spellEnd"/>
+      <w:r>
+        <w:t xml:space="preserve"> </w:t>
+      </w:r>
+      <w:proofErr w:type="spellStart"/>
+      <w:r>
+        <w:t>zelimo</w:t>
+      </w:r>
+      <w:proofErr w:type="spellEnd"/>
+      <w:r>
+        <w:t xml:space="preserve"> da </w:t>
+      </w:r>
+      <w:proofErr w:type="spellStart"/>
+      <w:r>
+        <w:t>imamo</w:t>
+      </w:r>
+      <w:proofErr w:type="spellEnd"/>
+      <w:r>
+        <w:t xml:space="preserve"> u </w:t>
+      </w:r>
+      <w:proofErr w:type="spellStart"/>
+      <w:r>
+        <w:t>bazi</w:t>
+      </w:r>
+      <w:proofErr w:type="spellEnd"/>
+      <w:r>
+        <w:t xml:space="preserve"> </w:t>
+      </w:r>
+      <w:proofErr w:type="spellStart"/>
+      <w:r>
+        <w:t>tj</w:t>
+      </w:r>
+      <w:proofErr w:type="spellEnd"/>
+      <w:r>
+        <w:t xml:space="preserve"> </w:t>
+      </w:r>
+      <w:proofErr w:type="spellStart"/>
+      <w:r>
+        <w:t>ubacimo</w:t>
+      </w:r>
+      <w:proofErr w:type="spellEnd"/>
+      <w:r>
+        <w:t xml:space="preserve"> u </w:t>
+      </w:r>
+      <w:proofErr w:type="spellStart"/>
+      <w:r>
+        <w:t>bazu</w:t>
+      </w:r>
+      <w:proofErr w:type="spellEnd"/>
+      <w:r>
+        <w:t xml:space="preserve">. To je </w:t>
+      </w:r>
+      <w:proofErr w:type="spellStart"/>
+      <w:r>
+        <w:t>kao</w:t>
+      </w:r>
+      <w:proofErr w:type="spellEnd"/>
+      <w:r>
+        <w:t xml:space="preserve"> most </w:t>
+      </w:r>
+      <w:proofErr w:type="spellStart"/>
+      <w:r>
+        <w:t>izmedju</w:t>
+      </w:r>
+      <w:proofErr w:type="spellEnd"/>
+      <w:r>
+        <w:t xml:space="preserve"> </w:t>
+      </w:r>
+      <w:proofErr w:type="spellStart"/>
+      <w:r>
+        <w:t>api</w:t>
+      </w:r>
+      <w:proofErr w:type="spellEnd"/>
+      <w:r>
+        <w:t xml:space="preserve"> I </w:t>
+      </w:r>
+      <w:proofErr w:type="spellStart"/>
+      <w:r>
+        <w:t>baze</w:t>
+      </w:r>
+      <w:proofErr w:type="spellEnd"/>
+      <w:r>
+        <w:t xml:space="preserve">  </w:t>
       </w:r>
     </w:p>
     <w:p>
@@ -231,7 +691,31 @@
         </w:tabs>
       </w:pPr>
       <w:r>
-        <w:t xml:space="preserve">Za upravljanje bazom u development koristimo SQLite </w:t>
+        <w:t xml:space="preserve">Za </w:t>
+      </w:r>
+      <w:proofErr w:type="spellStart"/>
+      <w:r>
+        <w:t>upravljanje</w:t>
+      </w:r>
+      <w:proofErr w:type="spellEnd"/>
+      <w:r>
+        <w:t xml:space="preserve"> </w:t>
+      </w:r>
+      <w:proofErr w:type="spellStart"/>
+      <w:r>
+        <w:t>bazom</w:t>
+      </w:r>
+      <w:proofErr w:type="spellEnd"/>
+      <w:r>
+        <w:t xml:space="preserve"> u development </w:t>
+      </w:r>
+      <w:proofErr w:type="spellStart"/>
+      <w:r>
+        <w:t>koristimo</w:t>
+      </w:r>
+      <w:proofErr w:type="spellEnd"/>
+      <w:r>
+        <w:t xml:space="preserve"> SQLite </w:t>
       </w:r>
     </w:p>
     <w:p>
@@ -241,7 +725,183 @@
         </w:tabs>
       </w:pPr>
       <w:r>
-        <w:t>Nasi kontroleli ce biti asinhorni kako bi moglo vise zahteva istovremeno da se odradi, time skracujemo vreme izvrsenja koda I znacajno ubrzavamo nasu aplikaciju I pripremamo je za veci broj korsinika.</w:t>
+        <w:t xml:space="preserve">Nasi </w:t>
+      </w:r>
+      <w:proofErr w:type="spellStart"/>
+      <w:r>
+        <w:t>kontroleli</w:t>
+      </w:r>
+      <w:proofErr w:type="spellEnd"/>
+      <w:r>
+        <w:t xml:space="preserve"> </w:t>
+      </w:r>
+      <w:proofErr w:type="spellStart"/>
+      <w:r>
+        <w:t>ce</w:t>
+      </w:r>
+      <w:proofErr w:type="spellEnd"/>
+      <w:r>
+        <w:t xml:space="preserve"> </w:t>
+      </w:r>
+      <w:proofErr w:type="spellStart"/>
+      <w:r>
+        <w:t>biti</w:t>
+      </w:r>
+      <w:proofErr w:type="spellEnd"/>
+      <w:r>
+        <w:t xml:space="preserve"> </w:t>
+      </w:r>
+      <w:proofErr w:type="spellStart"/>
+      <w:r>
+        <w:t>asinhorni</w:t>
+      </w:r>
+      <w:proofErr w:type="spellEnd"/>
+      <w:r>
+        <w:t xml:space="preserve"> </w:t>
+      </w:r>
+      <w:proofErr w:type="spellStart"/>
+      <w:r>
+        <w:t>kako</w:t>
+      </w:r>
+      <w:proofErr w:type="spellEnd"/>
+      <w:r>
+        <w:t xml:space="preserve"> </w:t>
+      </w:r>
+      <w:proofErr w:type="spellStart"/>
+      <w:r>
+        <w:t>bi</w:t>
+      </w:r>
+      <w:proofErr w:type="spellEnd"/>
+      <w:r>
+        <w:t xml:space="preserve"> </w:t>
+      </w:r>
+      <w:proofErr w:type="spellStart"/>
+      <w:r>
+        <w:t>moglo</w:t>
+      </w:r>
+      <w:proofErr w:type="spellEnd"/>
+      <w:r>
+        <w:t xml:space="preserve"> vise </w:t>
+      </w:r>
+      <w:proofErr w:type="spellStart"/>
+      <w:r>
+        <w:t>zahteva</w:t>
+      </w:r>
+      <w:proofErr w:type="spellEnd"/>
+      <w:r>
+        <w:t xml:space="preserve"> </w:t>
+      </w:r>
+      <w:proofErr w:type="spellStart"/>
+      <w:r>
+        <w:t>istovremeno</w:t>
+      </w:r>
+      <w:proofErr w:type="spellEnd"/>
+      <w:r>
+        <w:t xml:space="preserve"> da se </w:t>
+      </w:r>
+      <w:proofErr w:type="spellStart"/>
+      <w:r>
+        <w:t>odradi</w:t>
+      </w:r>
+      <w:proofErr w:type="spellEnd"/>
+      <w:r>
+        <w:t xml:space="preserve">, time </w:t>
+      </w:r>
+      <w:proofErr w:type="spellStart"/>
+      <w:r>
+        <w:t>skracujemo</w:t>
+      </w:r>
+      <w:proofErr w:type="spellEnd"/>
+      <w:r>
+        <w:t xml:space="preserve"> </w:t>
+      </w:r>
+      <w:proofErr w:type="spellStart"/>
+      <w:r>
+        <w:t>vreme</w:t>
+      </w:r>
+      <w:proofErr w:type="spellEnd"/>
+      <w:r>
+        <w:t xml:space="preserve"> </w:t>
+      </w:r>
+      <w:proofErr w:type="spellStart"/>
+      <w:r>
+        <w:t>izvrsenja</w:t>
+      </w:r>
+      <w:proofErr w:type="spellEnd"/>
+      <w:r>
+        <w:t xml:space="preserve"> </w:t>
+      </w:r>
+      <w:proofErr w:type="spellStart"/>
+      <w:r>
+        <w:t>koda</w:t>
+      </w:r>
+      <w:proofErr w:type="spellEnd"/>
+      <w:r>
+        <w:t xml:space="preserve"> I </w:t>
+      </w:r>
+      <w:proofErr w:type="spellStart"/>
+      <w:r>
+        <w:t>znacajno</w:t>
+      </w:r>
+      <w:proofErr w:type="spellEnd"/>
+      <w:r>
+        <w:t xml:space="preserve"> </w:t>
+      </w:r>
+      <w:proofErr w:type="spellStart"/>
+      <w:r>
+        <w:t>ubrzavamo</w:t>
+      </w:r>
+      <w:proofErr w:type="spellEnd"/>
+      <w:r>
+        <w:t xml:space="preserve"> </w:t>
+      </w:r>
+      <w:proofErr w:type="spellStart"/>
+      <w:r>
+        <w:t>nasu</w:t>
+      </w:r>
+      <w:proofErr w:type="spellEnd"/>
+      <w:r>
+        <w:t xml:space="preserve"> </w:t>
+      </w:r>
+      <w:proofErr w:type="spellStart"/>
+      <w:r>
+        <w:t>aplikaciju</w:t>
+      </w:r>
+      <w:proofErr w:type="spellEnd"/>
+      <w:r>
+        <w:t xml:space="preserve"> I </w:t>
+      </w:r>
+      <w:proofErr w:type="spellStart"/>
+      <w:r>
+        <w:t>pripremamo</w:t>
+      </w:r>
+      <w:proofErr w:type="spellEnd"/>
+      <w:r>
+        <w:t xml:space="preserve"> je za </w:t>
+      </w:r>
+      <w:proofErr w:type="spellStart"/>
+      <w:r>
+        <w:t>veci</w:t>
+      </w:r>
+      <w:proofErr w:type="spellEnd"/>
+      <w:r>
+        <w:t xml:space="preserve"> </w:t>
+      </w:r>
+      <w:proofErr w:type="spellStart"/>
+      <w:r>
+        <w:t>broj</w:t>
+      </w:r>
+      <w:proofErr w:type="spellEnd"/>
+      <w:r>
+        <w:t xml:space="preserve"> </w:t>
+      </w:r>
+      <w:proofErr w:type="spellStart"/>
+      <w:r>
+        <w:t>korsinika</w:t>
+      </w:r>
+      <w:proofErr w:type="spellEnd"/>
+      <w:r>
+        <w:t>.</w:t>
       </w:r>
     </w:p>
     <w:p>
@@ -251,8 +911,342 @@
         </w:tabs>
       </w:pPr>
       <w:r>
-        <w:t>Nas kod uploadujemo na github, skinulki smo git i inicijalizovali ga u nas projekat preko terminala I zartim napravili novi repo na nasem gihub nalogu I povezali sa nasim kodom</w:t>
-      </w:r>
+        <w:t xml:space="preserve">Nas </w:t>
+      </w:r>
+      <w:proofErr w:type="spellStart"/>
+      <w:r>
+        <w:t>kod</w:t>
+      </w:r>
+      <w:proofErr w:type="spellEnd"/>
+      <w:r>
+        <w:t xml:space="preserve"> </w:t>
+      </w:r>
+      <w:proofErr w:type="spellStart"/>
+      <w:r>
+        <w:t>uploadujemo</w:t>
+      </w:r>
+      <w:proofErr w:type="spellEnd"/>
+      <w:r>
+        <w:t xml:space="preserve"> </w:t>
+      </w:r>
+      <w:proofErr w:type="spellStart"/>
+      <w:r>
+        <w:t>na</w:t>
+      </w:r>
+      <w:proofErr w:type="spellEnd"/>
+      <w:r>
+        <w:t xml:space="preserve"> </w:t>
+      </w:r>
+      <w:proofErr w:type="spellStart"/>
+      <w:r>
+        <w:t>github</w:t>
+      </w:r>
+      <w:proofErr w:type="spellEnd"/>
+      <w:r>
+        <w:t xml:space="preserve">, </w:t>
+      </w:r>
+      <w:proofErr w:type="spellStart"/>
+      <w:r>
+        <w:t>skinulki</w:t>
+      </w:r>
+      <w:proofErr w:type="spellEnd"/>
+      <w:r>
+        <w:t xml:space="preserve"> </w:t>
+      </w:r>
+      <w:proofErr w:type="spellStart"/>
+      <w:r>
+        <w:t>smo</w:t>
+      </w:r>
+      <w:proofErr w:type="spellEnd"/>
+      <w:r>
+        <w:t xml:space="preserve"> git </w:t>
+      </w:r>
+      <w:proofErr w:type="spellStart"/>
+      <w:r>
+        <w:t>i</w:t>
+      </w:r>
+      <w:proofErr w:type="spellEnd"/>
+      <w:r>
+        <w:t xml:space="preserve"> </w:t>
+      </w:r>
+      <w:proofErr w:type="spellStart"/>
+      <w:r>
+        <w:t>inicijalizovali</w:t>
+      </w:r>
+      <w:proofErr w:type="spellEnd"/>
+      <w:r>
+        <w:t xml:space="preserve"> ga u </w:t>
+      </w:r>
+      <w:proofErr w:type="spellStart"/>
+      <w:r>
+        <w:t>nas</w:t>
+      </w:r>
+      <w:proofErr w:type="spellEnd"/>
+      <w:r>
+        <w:t xml:space="preserve"> </w:t>
+      </w:r>
+      <w:proofErr w:type="spellStart"/>
+      <w:r>
+        <w:t>projekat</w:t>
+      </w:r>
+      <w:proofErr w:type="spellEnd"/>
+      <w:r>
+        <w:t xml:space="preserve"> </w:t>
+      </w:r>
+      <w:proofErr w:type="spellStart"/>
+      <w:r>
+        <w:t>preko</w:t>
+      </w:r>
+      <w:proofErr w:type="spellEnd"/>
+      <w:r>
+        <w:t xml:space="preserve"> </w:t>
+      </w:r>
+      <w:proofErr w:type="spellStart"/>
+      <w:r>
+        <w:t>terminala</w:t>
+      </w:r>
+      <w:proofErr w:type="spellEnd"/>
+      <w:r>
+        <w:t xml:space="preserve"> I </w:t>
+      </w:r>
+      <w:proofErr w:type="spellStart"/>
+      <w:r>
+        <w:t>zartim</w:t>
+      </w:r>
+      <w:proofErr w:type="spellEnd"/>
+      <w:r>
+        <w:t xml:space="preserve"> </w:t>
+      </w:r>
+      <w:proofErr w:type="spellStart"/>
+      <w:r>
+        <w:t>napravili</w:t>
+      </w:r>
+      <w:proofErr w:type="spellEnd"/>
+      <w:r>
+        <w:t xml:space="preserve"> novi repo </w:t>
+      </w:r>
+      <w:proofErr w:type="spellStart"/>
+      <w:r>
+        <w:t>na</w:t>
+      </w:r>
+      <w:proofErr w:type="spellEnd"/>
+      <w:r>
+        <w:t xml:space="preserve"> </w:t>
+      </w:r>
+      <w:proofErr w:type="spellStart"/>
+      <w:r>
+        <w:t>nasem</w:t>
+      </w:r>
+      <w:proofErr w:type="spellEnd"/>
+      <w:r>
+        <w:t xml:space="preserve"> </w:t>
+      </w:r>
+      <w:proofErr w:type="spellStart"/>
+      <w:r>
+        <w:t>gihub</w:t>
+      </w:r>
+      <w:proofErr w:type="spellEnd"/>
+      <w:r>
+        <w:t xml:space="preserve"> </w:t>
+      </w:r>
+      <w:proofErr w:type="spellStart"/>
+      <w:r>
+        <w:t>nalogu</w:t>
+      </w:r>
+      <w:proofErr w:type="spellEnd"/>
+      <w:r>
+        <w:t xml:space="preserve"> I </w:t>
+      </w:r>
+      <w:proofErr w:type="spellStart"/>
+      <w:r>
+        <w:t>povezali</w:t>
+      </w:r>
+      <w:proofErr w:type="spellEnd"/>
+      <w:r>
+        <w:t xml:space="preserve"> </w:t>
+      </w:r>
+      <w:proofErr w:type="spellStart"/>
+      <w:r>
+        <w:t>sa</w:t>
+      </w:r>
+      <w:proofErr w:type="spellEnd"/>
+      <w:r>
+        <w:t xml:space="preserve"> </w:t>
+      </w:r>
+      <w:proofErr w:type="spellStart"/>
+      <w:r>
+        <w:t>nasim</w:t>
+      </w:r>
+      <w:proofErr w:type="spellEnd"/>
+      <w:r>
+        <w:t xml:space="preserve"> </w:t>
+      </w:r>
+      <w:proofErr w:type="spellStart"/>
+      <w:r>
+        <w:t>kodom</w:t>
+      </w:r>
+      <w:proofErr w:type="spellEnd"/>
+    </w:p>
+    <w:p>
+      <w:pPr>
+        <w:tabs>
+          <w:tab w:val="left" w:pos="8040"/>
+        </w:tabs>
+      </w:pPr>
+      <w:r>
+        <w:t xml:space="preserve">Prvi </w:t>
+      </w:r>
+      <w:proofErr w:type="spellStart"/>
+      <w:r>
+        <w:t>foldedr</w:t>
+      </w:r>
+      <w:proofErr w:type="spellEnd"/>
+      <w:r>
+        <w:t xml:space="preserve"> u </w:t>
+      </w:r>
+      <w:proofErr w:type="spellStart"/>
+      <w:r>
+        <w:t>naso</w:t>
+      </w:r>
+      <w:proofErr w:type="spellEnd"/>
+      <w:r>
+        <w:t xml:space="preserve"> </w:t>
+      </w:r>
+      <w:proofErr w:type="spellStart"/>
+      <w:r>
+        <w:t>aplikaciji</w:t>
+      </w:r>
+      <w:proofErr w:type="spellEnd"/>
+      <w:r>
+        <w:t xml:space="preserve"> </w:t>
+      </w:r>
+      <w:proofErr w:type="spellStart"/>
+      <w:r>
+        <w:t>su</w:t>
+      </w:r>
+      <w:proofErr w:type="spellEnd"/>
+      <w:r>
+        <w:t xml:space="preserve"> </w:t>
+      </w:r>
+      <w:proofErr w:type="spellStart"/>
+      <w:r>
+        <w:t>kontroleri</w:t>
+      </w:r>
+      <w:proofErr w:type="spellEnd"/>
+      <w:r>
+        <w:t xml:space="preserve">, </w:t>
+      </w:r>
+      <w:proofErr w:type="spellStart"/>
+      <w:r>
+        <w:t>kontroleri</w:t>
+      </w:r>
+      <w:proofErr w:type="spellEnd"/>
+      <w:r>
+        <w:t xml:space="preserve"> </w:t>
+      </w:r>
+      <w:proofErr w:type="spellStart"/>
+      <w:r>
+        <w:t>su</w:t>
+      </w:r>
+      <w:proofErr w:type="spellEnd"/>
+      <w:r>
+        <w:t xml:space="preserve"> </w:t>
+      </w:r>
+      <w:proofErr w:type="spellStart"/>
+      <w:r>
+        <w:t>podeljeni</w:t>
+      </w:r>
+      <w:proofErr w:type="spellEnd"/>
+      <w:r>
+        <w:t xml:space="preserve"> po </w:t>
+      </w:r>
+      <w:proofErr w:type="spellStart"/>
+      <w:r>
+        <w:t>oblasti</w:t>
+      </w:r>
+      <w:proofErr w:type="spellEnd"/>
+      <w:r>
+        <w:t xml:space="preserve"> za </w:t>
+      </w:r>
+      <w:proofErr w:type="spellStart"/>
+      <w:r>
+        <w:t>koju</w:t>
+      </w:r>
+      <w:proofErr w:type="spellEnd"/>
+      <w:r>
+        <w:t xml:space="preserve"> </w:t>
+      </w:r>
+      <w:proofErr w:type="spellStart"/>
+      <w:r>
+        <w:t>ce</w:t>
+      </w:r>
+      <w:proofErr w:type="spellEnd"/>
+      <w:r>
+        <w:t xml:space="preserve"> oni </w:t>
+      </w:r>
+      <w:proofErr w:type="spellStart"/>
+      <w:r>
+        <w:t>imati</w:t>
+      </w:r>
+      <w:proofErr w:type="spellEnd"/>
+      <w:r>
+        <w:t xml:space="preserve"> </w:t>
+      </w:r>
+      <w:proofErr w:type="spellStart"/>
+      <w:r>
+        <w:t>funkcije</w:t>
+      </w:r>
+      <w:proofErr w:type="spellEnd"/>
+      <w:r>
+        <w:t xml:space="preserve"> </w:t>
+      </w:r>
+      <w:proofErr w:type="spellStart"/>
+      <w:r>
+        <w:t>kao</w:t>
+      </w:r>
+      <w:proofErr w:type="spellEnd"/>
+      <w:r>
+        <w:t xml:space="preserve"> </w:t>
+      </w:r>
+      <w:proofErr w:type="spellStart"/>
+      <w:r>
+        <w:t>UserController</w:t>
+      </w:r>
+      <w:proofErr w:type="spellEnd"/>
+      <w:r>
+        <w:t xml:space="preserve">, </w:t>
+      </w:r>
+      <w:proofErr w:type="spellStart"/>
+      <w:r>
+        <w:t>AdminController</w:t>
+      </w:r>
+      <w:proofErr w:type="spellEnd"/>
+      <w:r>
+        <w:t xml:space="preserve">, </w:t>
+      </w:r>
+      <w:proofErr w:type="spellStart"/>
+      <w:r>
+        <w:t>AccountContorller</w:t>
+      </w:r>
+      <w:proofErr w:type="spellEnd"/>
+      <w:r>
+        <w:t xml:space="preserve"> </w:t>
+      </w:r>
+      <w:proofErr w:type="spellStart"/>
+      <w:r>
+        <w:t>itd</w:t>
+      </w:r>
+      <w:proofErr w:type="spellEnd"/>
+      <w:r>
+        <w:t xml:space="preserve">… </w:t>
+      </w:r>
+    </w:p>
+    <w:p>
+      <w:pPr>
+        <w:tabs>
+          <w:tab w:val="left" w:pos="8040"/>
+        </w:tabs>
+      </w:pPr>
     </w:p>
     <w:p>
       <w:pPr>
@@ -299,7 +1293,7 @@
 </file>
 
 <file path=word/endnotes.xml><?xml version="1.0" encoding="utf-8"?>
-<w:endnotes xmlns:wpc="http://schemas.microsoft.com/office/word/2010/wordprocessingCanvas" xmlns:cx="http://schemas.microsoft.com/office/drawing/2014/chartex" xmlns:cx1="http://schemas.microsoft.com/office/drawing/2015/9/8/chartex" xmlns:cx2="http://schemas.microsoft.com/office/drawing/2015/10/21/chartex" xmlns:cx3="http://schemas.microsoft.com/office/drawing/2016/5/9/chartex" xmlns:cx4="http://schemas.microsoft.com/office/drawing/2016/5/10/chartex" xmlns:cx5="http://schemas.microsoft.com/office/drawing/2016/5/11/chartex" xmlns:cx6="http://schemas.microsoft.com/office/drawing/2016/5/12/chartex" xmlns:cx7="http://schemas.microsoft.com/office/drawing/2016/5/13/chartex" xmlns:cx8="http://schemas.microsoft.com/office/drawing/2016/5/14/chartex" xmlns:mc="http://schemas.openxmlformats.org/markup-compatibility/2006" xmlns:aink="http://schemas.microsoft.com/office/drawing/2016/ink" xmlns:am3d="http://schemas.microsoft.com/office/drawing/2017/model3d" xmlns:o="urn:schemas-microsoft-com:office:office" xmlns:oel="http://schemas.microsoft.com/office/2019/extlst" xmlns:r="http://schemas.openxmlformats.org/officeDocument/2006/relationships" xmlns:m="http://schemas.openxmlformats.org/officeDocument/2006/math" xmlns:v="urn:schemas-microsoft-com:vml" xmlns:wp14="http://schemas.microsoft.com/office/word/2010/wordprocessingDrawing" xmlns:wp="http://schemas.openxmlformats.org/drawingml/2006/wordprocessingDrawing" xmlns:w10="urn:schemas-microsoft-com:office:word" xmlns:w="http://schemas.openxmlformats.org/wordprocessingml/2006/main" xmlns:w14="http://schemas.microsoft.com/office/word/2010/wordml" xmlns:w15="http://schemas.microsoft.com/office/word/2012/wordml" xmlns:w16cex="http://schemas.microsoft.com/office/word/2018/wordml/cex" xmlns:w16cid="http://schemas.microsoft.com/office/word/2016/wordml/cid" xmlns:w16="http://schemas.microsoft.com/office/word/2018/wordml" xmlns:w16du="http://schemas.microsoft.com/office/word/2023/wordml/word16du" xmlns:w16sdtdh="http://schemas.microsoft.com/office/word/2020/wordml/sdtdatahash" xmlns:w16se="http://schemas.microsoft.com/office/word/2015/wordml/symex" xmlns:wpg="http://schemas.microsoft.com/office/word/2010/wordprocessingGroup" xmlns:wpi="http://schemas.microsoft.com/office/word/2010/wordprocessingInk" xmlns:wne="http://schemas.microsoft.com/office/word/2006/wordml" xmlns:wps="http://schemas.microsoft.com/office/word/2010/wordprocessingShape" mc:Ignorable="w14 w15 w16se w16cid w16 w16cex w16sdtdh w16du wp14">
+<w:endnotes xmlns:wpc="http://schemas.microsoft.com/office/word/2010/wordprocessingCanvas" xmlns:cx="http://schemas.microsoft.com/office/drawing/2014/chartex" xmlns:cx1="http://schemas.microsoft.com/office/drawing/2015/9/8/chartex" xmlns:cx2="http://schemas.microsoft.com/office/drawing/2015/10/21/chartex" xmlns:cx3="http://schemas.microsoft.com/office/drawing/2016/5/9/chartex" xmlns:cx4="http://schemas.microsoft.com/office/drawing/2016/5/10/chartex" xmlns:cx5="http://schemas.microsoft.com/office/drawing/2016/5/11/chartex" xmlns:cx6="http://schemas.microsoft.com/office/drawing/2016/5/12/chartex" xmlns:cx7="http://schemas.microsoft.com/office/drawing/2016/5/13/chartex" xmlns:cx8="http://schemas.microsoft.com/office/drawing/2016/5/14/chartex" xmlns:mc="http://schemas.openxmlformats.org/markup-compatibility/2006" xmlns:aink="http://schemas.microsoft.com/office/drawing/2016/ink" xmlns:am3d="http://schemas.microsoft.com/office/drawing/2017/model3d" xmlns:o="urn:schemas-microsoft-com:office:office" xmlns:oel="http://schemas.microsoft.com/office/2019/extlst" xmlns:r="http://schemas.openxmlformats.org/officeDocument/2006/relationships" xmlns:m="http://schemas.openxmlformats.org/officeDocument/2006/math" xmlns:v="urn:schemas-microsoft-com:vml" xmlns:wp14="http://schemas.microsoft.com/office/word/2010/wordprocessingDrawing" xmlns:wp="http://schemas.openxmlformats.org/drawingml/2006/wordprocessingDrawing" xmlns:w10="urn:schemas-microsoft-com:office:word" xmlns:w="http://schemas.openxmlformats.org/wordprocessingml/2006/main" xmlns:w14="http://schemas.microsoft.com/office/word/2010/wordml" xmlns:w15="http://schemas.microsoft.com/office/word/2012/wordml" xmlns:w16cex="http://schemas.microsoft.com/office/word/2018/wordml/cex" xmlns:w16cid="http://schemas.microsoft.com/office/word/2016/wordml/cid" xmlns:w16="http://schemas.microsoft.com/office/word/2018/wordml" xmlns:w16du="http://schemas.microsoft.com/office/word/2023/wordml/word16du" xmlns:w16sdtdh="http://schemas.microsoft.com/office/word/2020/wordml/sdtdatahash" xmlns:w16sdtfl="http://schemas.microsoft.com/office/word/2024/wordml/sdtformatlock" xmlns:w16se="http://schemas.microsoft.com/office/word/2015/wordml/symex" xmlns:wpg="http://schemas.microsoft.com/office/word/2010/wordprocessingGroup" xmlns:wpi="http://schemas.microsoft.com/office/word/2010/wordprocessingInk" xmlns:wne="http://schemas.microsoft.com/office/word/2006/wordml" xmlns:wps="http://schemas.microsoft.com/office/word/2010/wordprocessingShape" mc:Ignorable="w14 w15 w16se w16cid w16 w16cex w16sdtdh w16sdtfl w16du wp14">
   <w:endnote w:type="separator" w:id="-1">
     <w:p>
       <w:pPr>
@@ -324,7 +1318,7 @@
 </file>
 
 <file path=word/footnotes.xml><?xml version="1.0" encoding="utf-8"?>
-<w:footnotes xmlns:wpc="http://schemas.microsoft.com/office/word/2010/wordprocessingCanvas" xmlns:cx="http://schemas.microsoft.com/office/drawing/2014/chartex" xmlns:cx1="http://schemas.microsoft.com/office/drawing/2015/9/8/chartex" xmlns:cx2="http://schemas.microsoft.com/office/drawing/2015/10/21/chartex" xmlns:cx3="http://schemas.microsoft.com/office/drawing/2016/5/9/chartex" xmlns:cx4="http://schemas.microsoft.com/office/drawing/2016/5/10/chartex" xmlns:cx5="http://schemas.microsoft.com/office/drawing/2016/5/11/chartex" xmlns:cx6="http://schemas.microsoft.com/office/drawing/2016/5/12/chartex" xmlns:cx7="http://schemas.microsoft.com/office/drawing/2016/5/13/chartex" xmlns:cx8="http://schemas.microsoft.com/office/drawing/2016/5/14/chartex" xmlns:mc="http://schemas.openxmlformats.org/markup-compatibility/2006" xmlns:aink="http://schemas.microsoft.com/office/drawing/2016/ink" xmlns:am3d="http://schemas.microsoft.com/office/drawing/2017/model3d" xmlns:o="urn:schemas-microsoft-com:office:office" xmlns:oel="http://schemas.microsoft.com/office/2019/extlst" xmlns:r="http://schemas.openxmlformats.org/officeDocument/2006/relationships" xmlns:m="http://schemas.openxmlformats.org/officeDocument/2006/math" xmlns:v="urn:schemas-microsoft-com:vml" xmlns:wp14="http://schemas.microsoft.com/office/word/2010/wordprocessingDrawing" xmlns:wp="http://schemas.openxmlformats.org/drawingml/2006/wordprocessingDrawing" xmlns:w10="urn:schemas-microsoft-com:office:word" xmlns:w="http://schemas.openxmlformats.org/wordprocessingml/2006/main" xmlns:w14="http://schemas.microsoft.com/office/word/2010/wordml" xmlns:w15="http://schemas.microsoft.com/office/word/2012/wordml" xmlns:w16cex="http://schemas.microsoft.com/office/word/2018/wordml/cex" xmlns:w16cid="http://schemas.microsoft.com/office/word/2016/wordml/cid" xmlns:w16="http://schemas.microsoft.com/office/word/2018/wordml" xmlns:w16du="http://schemas.microsoft.com/office/word/2023/wordml/word16du" xmlns:w16sdtdh="http://schemas.microsoft.com/office/word/2020/wordml/sdtdatahash" xmlns:w16se="http://schemas.microsoft.com/office/word/2015/wordml/symex" xmlns:wpg="http://schemas.microsoft.com/office/word/2010/wordprocessingGroup" xmlns:wpi="http://schemas.microsoft.com/office/word/2010/wordprocessingInk" xmlns:wne="http://schemas.microsoft.com/office/word/2006/wordml" xmlns:wps="http://schemas.microsoft.com/office/word/2010/wordprocessingShape" mc:Ignorable="w14 w15 w16se w16cid w16 w16cex w16sdtdh w16du wp14">
+<w:footnotes xmlns:wpc="http://schemas.microsoft.com/office/word/2010/wordprocessingCanvas" xmlns:cx="http://schemas.microsoft.com/office/drawing/2014/chartex" xmlns:cx1="http://schemas.microsoft.com/office/drawing/2015/9/8/chartex" xmlns:cx2="http://schemas.microsoft.com/office/drawing/2015/10/21/chartex" xmlns:cx3="http://schemas.microsoft.com/office/drawing/2016/5/9/chartex" xmlns:cx4="http://schemas.microsoft.com/office/drawing/2016/5/10/chartex" xmlns:cx5="http://schemas.microsoft.com/office/drawing/2016/5/11/chartex" xmlns:cx6="http://schemas.microsoft.com/office/drawing/2016/5/12/chartex" xmlns:cx7="http://schemas.microsoft.com/office/drawing/2016/5/13/chartex" xmlns:cx8="http://schemas.microsoft.com/office/drawing/2016/5/14/chartex" xmlns:mc="http://schemas.openxmlformats.org/markup-compatibility/2006" xmlns:aink="http://schemas.microsoft.com/office/drawing/2016/ink" xmlns:am3d="http://schemas.microsoft.com/office/drawing/2017/model3d" xmlns:o="urn:schemas-microsoft-com:office:office" xmlns:oel="http://schemas.microsoft.com/office/2019/extlst" xmlns:r="http://schemas.openxmlformats.org/officeDocument/2006/relationships" xmlns:m="http://schemas.openxmlformats.org/officeDocument/2006/math" xmlns:v="urn:schemas-microsoft-com:vml" xmlns:wp14="http://schemas.microsoft.com/office/word/2010/wordprocessingDrawing" xmlns:wp="http://schemas.openxmlformats.org/drawingml/2006/wordprocessingDrawing" xmlns:w10="urn:schemas-microsoft-com:office:word" xmlns:w="http://schemas.openxmlformats.org/wordprocessingml/2006/main" xmlns:w14="http://schemas.microsoft.com/office/word/2010/wordml" xmlns:w15="http://schemas.microsoft.com/office/word/2012/wordml" xmlns:w16cex="http://schemas.microsoft.com/office/word/2018/wordml/cex" xmlns:w16cid="http://schemas.microsoft.com/office/word/2016/wordml/cid" xmlns:w16="http://schemas.microsoft.com/office/word/2018/wordml" xmlns:w16du="http://schemas.microsoft.com/office/word/2023/wordml/word16du" xmlns:w16sdtdh="http://schemas.microsoft.com/office/word/2020/wordml/sdtdatahash" xmlns:w16sdtfl="http://schemas.microsoft.com/office/word/2024/wordml/sdtformatlock" xmlns:w16se="http://schemas.microsoft.com/office/word/2015/wordml/symex" xmlns:wpg="http://schemas.microsoft.com/office/word/2010/wordprocessingGroup" xmlns:wpi="http://schemas.microsoft.com/office/word/2010/wordprocessingInk" xmlns:wne="http://schemas.microsoft.com/office/word/2006/wordml" xmlns:wps="http://schemas.microsoft.com/office/word/2010/wordprocessingShape" mc:Ignorable="w14 w15 w16se w16cid w16 w16cex w16sdtdh w16sdtfl w16du wp14">
   <w:footnote w:type="separator" w:id="-1">
     <w:p>
       <w:pPr>
@@ -349,7 +1343,7 @@
 </file>
 
 <file path=word/styles.xml><?xml version="1.0" encoding="utf-8"?>
-<w:styles xmlns:mc="http://schemas.openxmlformats.org/markup-compatibility/2006" xmlns:r="http://schemas.openxmlformats.org/officeDocument/2006/relationships" xmlns:w="http://schemas.openxmlformats.org/wordprocessingml/2006/main" xmlns:w14="http://schemas.microsoft.com/office/word/2010/wordml" xmlns:w15="http://schemas.microsoft.com/office/word/2012/wordml" xmlns:w16cex="http://schemas.microsoft.com/office/word/2018/wordml/cex" xmlns:w16cid="http://schemas.microsoft.com/office/word/2016/wordml/cid" xmlns:w16="http://schemas.microsoft.com/office/word/2018/wordml" xmlns:w16du="http://schemas.microsoft.com/office/word/2023/wordml/word16du" xmlns:w16sdtdh="http://schemas.microsoft.com/office/word/2020/wordml/sdtdatahash" xmlns:w16se="http://schemas.microsoft.com/office/word/2015/wordml/symex" mc:Ignorable="w14 w15 w16se w16cid w16 w16cex w16sdtdh w16du">
+<w:styles xmlns:mc="http://schemas.openxmlformats.org/markup-compatibility/2006" xmlns:r="http://schemas.openxmlformats.org/officeDocument/2006/relationships" xmlns:w="http://schemas.openxmlformats.org/wordprocessingml/2006/main" xmlns:w14="http://schemas.microsoft.com/office/word/2010/wordml" xmlns:w15="http://schemas.microsoft.com/office/word/2012/wordml" xmlns:w16cex="http://schemas.microsoft.com/office/word/2018/wordml/cex" xmlns:w16cid="http://schemas.microsoft.com/office/word/2016/wordml/cid" xmlns:w16="http://schemas.microsoft.com/office/word/2018/wordml" xmlns:w16du="http://schemas.microsoft.com/office/word/2023/wordml/word16du" xmlns:w16sdtdh="http://schemas.microsoft.com/office/word/2020/wordml/sdtdatahash" xmlns:w16sdtfl="http://schemas.microsoft.com/office/word/2024/wordml/sdtformatlock" xmlns:w16se="http://schemas.microsoft.com/office/word/2015/wordml/symex" mc:Ignorable="w14 w15 w16se w16cid w16 w16cex w16sdtdh w16sdtfl w16du">
   <w:docDefaults>
     <w:rPrDefault>
       <w:rPr>

</xml_diff>